<commit_message>
Fix: Document preview search highlighting now uses mark.js consistently across all viewers (PDF, DOCX, XLS)
</commit_message>
<xml_diff>
--- a/RFI-Docs/082225 - Draft Oral Statement - Wiechers_final.docx
+++ b/RFI-Docs/082225 - Draft Oral Statement - Wiechers_final.docx
@@ -4,6 +4,138 @@
   <w:body>
     <w:p>
       <w:pPr>
+        <w:jc w:val="left"/>
+      </w:pPr>
+      <w:r>
+        <w:rPr>
+          <w:color w:val="646464"/>
+          <w:sz w:val="18"/>
+        </w:rPr>
+        <w:t>Document: 082225 - Draft Oral Statement - Wiechers_final.docx</w:t>
+      </w:r>
+    </w:p>
+    <w:p>
+      <w:pPr>
+        <w:jc w:val="left"/>
+      </w:pPr>
+      <w:r>
+        <w:rPr>
+          <w:color w:val="646464"/>
+          <w:sz w:val="18"/>
+        </w:rPr>
+        <w:t>Title: Alternative Mental Health Therapies Oral Testimony 8.22.2025</w:t>
+      </w:r>
+    </w:p>
+    <w:p>
+      <w:pPr>
+        <w:jc w:val="left"/>
+      </w:pPr>
+      <w:r>
+        <w:rPr>
+          <w:color w:val="646464"/>
+          <w:sz w:val="18"/>
+        </w:rPr>
+        <w:t>Topic: Mental Health | Type: Testimony and Statements</w:t>
+      </w:r>
+    </w:p>
+    <w:p>
+      <w:pPr>
+        <w:jc w:val="left"/>
+      </w:pPr>
+      <w:r>
+        <w:rPr>
+          <w:color w:val="646464"/>
+          <w:sz w:val="18"/>
+        </w:rPr>
+        <w:t>Created: 2025-09-22 | By: Friedland, Bruce I.</w:t>
+      </w:r>
+    </w:p>
+    <w:p>
+      <w:pPr>
+        <w:jc w:val="left"/>
+      </w:pPr>
+      <w:r>
+        <w:rPr>
+          <w:color w:val="646464"/>
+          <w:sz w:val="18"/>
+        </w:rPr>
+        <w:t>Modified: 2025-09-22 | By: Friedland, Bruce I.</w:t>
+      </w:r>
+    </w:p>
+    <w:p>
+      <w:pPr>
+        <w:jc w:val="left"/>
+      </w:pPr>
+      <w:r>
+        <w:rPr>
+          <w:color w:val="C8C8C8"/>
+          <w:sz w:val="16"/>
+        </w:rPr>
+        <w:t>────────────────────────────────────────────────────────────────────────────────</w:t>
+      </w:r>
+    </w:p>
+    <w:p>
+      <w:pPr>
+        <w:jc w:val="left"/>
+      </w:pPr>
+      <w:r/>
+    </w:p>
+    <w:p>
+      <w:pPr>
+        <w:jc w:val="left"/>
+      </w:pPr>
+      <w:r>
+        <w:rPr>
+          <w:color w:val="646464"/>
+          <w:sz w:val="18"/>
+        </w:rPr>
+        <w:t>Topic: Mental Health | Type: Testimony and Statements</w:t>
+      </w:r>
+    </w:p>
+    <w:p>
+      <w:pPr>
+        <w:jc w:val="left"/>
+      </w:pPr>
+      <w:r>
+        <w:rPr>
+          <w:color w:val="646464"/>
+          <w:sz w:val="18"/>
+        </w:rPr>
+        <w:t>Created: 2025-09-22 | By: Friedland, Bruce I.</w:t>
+      </w:r>
+    </w:p>
+    <w:p>
+      <w:pPr>
+        <w:jc w:val="left"/>
+      </w:pPr>
+      <w:r>
+        <w:rPr>
+          <w:color w:val="646464"/>
+          <w:sz w:val="18"/>
+        </w:rPr>
+        <w:t>Modified: 2025-09-22 | By: Friedland, Bruce I.</w:t>
+      </w:r>
+    </w:p>
+    <w:p>
+      <w:pPr>
+        <w:spacing w:after="0" w:line="240" w:lineRule="auto"/>
+        <w:jc w:val="left"/>
+        <w:rPr>
+          <w:rFonts w:ascii="Arial" w:hAnsi="Arial" w:cs="Arial"/>
+          <w:b/>
+          <w:bCs/>
+        </w:rPr>
+      </w:pPr>
+      <w:r>
+        <w:rPr>
+          <w:color w:val="C8C8C8"/>
+          <w:sz w:val="16"/>
+        </w:rPr>
+        <w:t>────────────────────────────────────────────────────────────────────────────────</w:t>
+      </w:r>
+    </w:p>
+    <w:p>
+      <w:pPr>
         <w:spacing w:after="0" w:line="240" w:lineRule="auto"/>
         <w:jc w:val="center"/>
         <w:rPr>
@@ -12,33 +144,7 @@
           <w:bCs/>
         </w:rPr>
       </w:pPr>
-      <w:r>
-        <w:rPr>
-          <w:rFonts w:ascii="Arial" w:hAnsi="Arial" w:cs="Arial"/>
-          <w:b/>
-          <w:bCs/>
-        </w:rPr>
-        <w:t>STATEMENT OF</w:t>
-      </w:r>
-    </w:p>
-    <w:p>
-      <w:pPr>
-        <w:spacing w:after="0" w:line="240" w:lineRule="auto"/>
-        <w:jc w:val="center"/>
-        <w:rPr>
-          <w:rFonts w:ascii="Arial" w:hAnsi="Arial" w:cs="Arial"/>
-          <w:b/>
-          <w:bCs/>
-        </w:rPr>
-      </w:pPr>
-      <w:r>
-        <w:rPr>
-          <w:rFonts w:ascii="Arial" w:hAnsi="Arial" w:cs="Arial"/>
-          <w:b/>
-          <w:bCs/>
-        </w:rPr>
-        <w:t>ILSE WIECHERS, MD, MPP, MHS</w:t>
-      </w:r>
+      <w:r/>
     </w:p>
     <w:p>
       <w:pPr>

</xml_diff>